<commit_message>
Menu « Administration de ma délégation » ; Koung-Khi : Poumougne au lieu de Bandjoun
- Le menu d'administration du DD porte sur SA délégation : son titre le dit,
  à distinguer de l'« Administration du système »
- Koung-Khi : l'arrondissement s'appelle Poumougne (chef-lieu Bandjoun),
  compte da.poumougne ; Bayangam et Djebem inchangés (correction du Délégué) ;
  modèles Word du Koung-Khi refaits

Co-Authored-By: Claude Opus 5.5 <noreply@anthropic.com>
</commit_message>
<xml_diff>
--- a/templates/rapport_mensuel_DD_KKH.docx
+++ b/templates/rapport_mensuel_DD_KKH.docx
@@ -648,98 +648,98 @@
         <w:tc>
           <w:p>
             <w:r>
-              <w:t xml:space="preserve">BANDJOUN</w:t>
-            </w:r>
-          </w:p>
-        </w:tc>
-        <w:tc>
-          <w:p>
-            <w:r>
-              <w:t xml:space="preserve">{T11_CHEPTEL_BOVIN_BDN}</w:t>
-            </w:r>
-          </w:p>
-        </w:tc>
-        <w:tc>
-          <w:p>
-            <w:r>
-              <w:t xml:space="preserve">{T11_CHEPTEL_OVIN_BDN}</w:t>
-            </w:r>
-          </w:p>
-        </w:tc>
-        <w:tc>
-          <w:p>
-            <w:r>
-              <w:t xml:space="preserve">{T11_CHEPTEL_CAPRIN_BDN}</w:t>
-            </w:r>
-          </w:p>
-        </w:tc>
-        <w:tc>
-          <w:p>
-            <w:r>
-              <w:t xml:space="preserve">{T11_CHEPTEL_PORCIN_BDN}</w:t>
-            </w:r>
-          </w:p>
-        </w:tc>
-        <w:tc>
-          <w:p>
-            <w:r>
-              <w:t xml:space="preserve">{T11_CHEPTEL_CAMELIN_BDN}</w:t>
-            </w:r>
-          </w:p>
-        </w:tc>
-        <w:tc>
-          <w:p>
-            <w:r>
-              <w:t xml:space="preserve">{T11_CHEPTEL_ASIN_BDN}</w:t>
-            </w:r>
-          </w:p>
-        </w:tc>
-        <w:tc>
-          <w:p>
-            <w:r>
-              <w:t xml:space="preserve">{T11_CHEPTEL_EQUIN_BDN}</w:t>
-            </w:r>
-          </w:p>
-        </w:tc>
-        <w:tc>
-          <w:p>
-            <w:r>
-              <w:t xml:space="preserve">{T11_CHEPTEL_CANIN_BDN}</w:t>
-            </w:r>
-          </w:p>
-        </w:tc>
-        <w:tc>
-          <w:p>
-            <w:r>
-              <w:t xml:space="preserve">{T11_CHEPTEL_LAPIN_BDN}</w:t>
-            </w:r>
-          </w:p>
-        </w:tc>
-        <w:tc>
-          <w:p>
-            <w:r>
-              <w:t xml:space="preserve">{T11_CHEPTEL_AULACODE_BDN}</w:t>
-            </w:r>
-          </w:p>
-        </w:tc>
-        <w:tc>
-          <w:p>
-            <w:r>
-              <w:t xml:space="preserve">{T11_CHEPTEL_FELIN_BDN}</w:t>
-            </w:r>
-          </w:p>
-        </w:tc>
-        <w:tc>
-          <w:p>
-            <w:r>
-              <w:t xml:space="preserve">{T11_CHEPTEL_COBAYE_BDN}</w:t>
-            </w:r>
-          </w:p>
-        </w:tc>
-        <w:tc>
-          <w:p>
-            <w:r>
-              <w:t xml:space="preserve">{T11_CHEPTEL_PRIMATE_BDN}</w:t>
+              <w:t xml:space="preserve">POUMOUGNE</w:t>
+            </w:r>
+          </w:p>
+        </w:tc>
+        <w:tc>
+          <w:p>
+            <w:r>
+              <w:t xml:space="preserve">{T11_CHEPTEL_BOVIN_PMG}</w:t>
+            </w:r>
+          </w:p>
+        </w:tc>
+        <w:tc>
+          <w:p>
+            <w:r>
+              <w:t xml:space="preserve">{T11_CHEPTEL_OVIN_PMG}</w:t>
+            </w:r>
+          </w:p>
+        </w:tc>
+        <w:tc>
+          <w:p>
+            <w:r>
+              <w:t xml:space="preserve">{T11_CHEPTEL_CAPRIN_PMG}</w:t>
+            </w:r>
+          </w:p>
+        </w:tc>
+        <w:tc>
+          <w:p>
+            <w:r>
+              <w:t xml:space="preserve">{T11_CHEPTEL_PORCIN_PMG}</w:t>
+            </w:r>
+          </w:p>
+        </w:tc>
+        <w:tc>
+          <w:p>
+            <w:r>
+              <w:t xml:space="preserve">{T11_CHEPTEL_CAMELIN_PMG}</w:t>
+            </w:r>
+          </w:p>
+        </w:tc>
+        <w:tc>
+          <w:p>
+            <w:r>
+              <w:t xml:space="preserve">{T11_CHEPTEL_ASIN_PMG}</w:t>
+            </w:r>
+          </w:p>
+        </w:tc>
+        <w:tc>
+          <w:p>
+            <w:r>
+              <w:t xml:space="preserve">{T11_CHEPTEL_EQUIN_PMG}</w:t>
+            </w:r>
+          </w:p>
+        </w:tc>
+        <w:tc>
+          <w:p>
+            <w:r>
+              <w:t xml:space="preserve">{T11_CHEPTEL_CANIN_PMG}</w:t>
+            </w:r>
+          </w:p>
+        </w:tc>
+        <w:tc>
+          <w:p>
+            <w:r>
+              <w:t xml:space="preserve">{T11_CHEPTEL_LAPIN_PMG}</w:t>
+            </w:r>
+          </w:p>
+        </w:tc>
+        <w:tc>
+          <w:p>
+            <w:r>
+              <w:t xml:space="preserve">{T11_CHEPTEL_AULACODE_PMG}</w:t>
+            </w:r>
+          </w:p>
+        </w:tc>
+        <w:tc>
+          <w:p>
+            <w:r>
+              <w:t xml:space="preserve">{T11_CHEPTEL_FELIN_PMG}</w:t>
+            </w:r>
+          </w:p>
+        </w:tc>
+        <w:tc>
+          <w:p>
+            <w:r>
+              <w:t xml:space="preserve">{T11_CHEPTEL_COBAYE_PMG}</w:t>
+            </w:r>
+          </w:p>
+        </w:tc>
+        <w:tc>
+          <w:p>
+            <w:r>
+              <w:t xml:space="preserve">{T11_CHEPTEL_PRIMATE_PMG}</w:t>
             </w:r>
           </w:p>
         </w:tc>
@@ -1387,7 +1387,7 @@
                 <w:b/>
                 <w:bCs/>
               </w:rPr>
-              <w:t xml:space="preserve">BANDJOUN</w:t>
+              <w:t xml:space="preserve">POUMOUGNE</w:t>
             </w:r>
           </w:p>
         </w:tc>
@@ -1401,70 +1401,70 @@
         <w:tc>
           <w:p>
             <w:r>
-              <w:t xml:space="preserve">{T12_VOL_MOD_POULET_CHAIR_BDN}</w:t>
-            </w:r>
-          </w:p>
-        </w:tc>
-        <w:tc>
-          <w:p>
-            <w:r>
-              <w:t xml:space="preserve">{T12_VOL_MOD_PONDEUSE_BDN}</w:t>
-            </w:r>
-          </w:p>
-        </w:tc>
-        <w:tc>
-          <w:p>
-            <w:r>
-              <w:t xml:space="preserve">{T12_VOL_MOD_POULET_VILLAGEOIS_BDN}</w:t>
-            </w:r>
-          </w:p>
-        </w:tc>
-        <w:tc>
-          <w:p>
-            <w:r>
-              <w:t xml:space="preserve">{T12_VOL_MOD_CANARD_BDN}</w:t>
-            </w:r>
-          </w:p>
-        </w:tc>
-        <w:tc>
-          <w:p>
-            <w:r>
-              <w:t xml:space="preserve">{T12_VOL_MOD_OIE_BDN}</w:t>
-            </w:r>
-          </w:p>
-        </w:tc>
-        <w:tc>
-          <w:p>
-            <w:r>
-              <w:t xml:space="preserve">{T12_VOL_MOD_DINDE_BDN}</w:t>
-            </w:r>
-          </w:p>
-        </w:tc>
-        <w:tc>
-          <w:p>
-            <w:r>
-              <w:t xml:space="preserve">{T12_VOL_MOD_CAILLE_BDN}</w:t>
-            </w:r>
-          </w:p>
-        </w:tc>
-        <w:tc>
-          <w:p>
-            <w:r>
-              <w:t xml:space="preserve">{T12_VOL_MOD_PIGEON_BDN}</w:t>
-            </w:r>
-          </w:p>
-        </w:tc>
-        <w:tc>
-          <w:p>
-            <w:r>
-              <w:t xml:space="preserve">{T12_VOL_MOD_PINTADE_BDN}</w:t>
-            </w:r>
-          </w:p>
-        </w:tc>
-        <w:tc>
-          <w:p>
-            <w:r>
-              <w:t xml:space="preserve">{T12_VOL_MOD_PAON_BDN}</w:t>
+              <w:t xml:space="preserve">{T12_VOL_MOD_POULET_CHAIR_PMG}</w:t>
+            </w:r>
+          </w:p>
+        </w:tc>
+        <w:tc>
+          <w:p>
+            <w:r>
+              <w:t xml:space="preserve">{T12_VOL_MOD_PONDEUSE_PMG}</w:t>
+            </w:r>
+          </w:p>
+        </w:tc>
+        <w:tc>
+          <w:p>
+            <w:r>
+              <w:t xml:space="preserve">{T12_VOL_MOD_POULET_VILLAGEOIS_PMG}</w:t>
+            </w:r>
+          </w:p>
+        </w:tc>
+        <w:tc>
+          <w:p>
+            <w:r>
+              <w:t xml:space="preserve">{T12_VOL_MOD_CANARD_PMG}</w:t>
+            </w:r>
+          </w:p>
+        </w:tc>
+        <w:tc>
+          <w:p>
+            <w:r>
+              <w:t xml:space="preserve">{T12_VOL_MOD_OIE_PMG}</w:t>
+            </w:r>
+          </w:p>
+        </w:tc>
+        <w:tc>
+          <w:p>
+            <w:r>
+              <w:t xml:space="preserve">{T12_VOL_MOD_DINDE_PMG}</w:t>
+            </w:r>
+          </w:p>
+        </w:tc>
+        <w:tc>
+          <w:p>
+            <w:r>
+              <w:t xml:space="preserve">{T12_VOL_MOD_CAILLE_PMG}</w:t>
+            </w:r>
+          </w:p>
+        </w:tc>
+        <w:tc>
+          <w:p>
+            <w:r>
+              <w:t xml:space="preserve">{T12_VOL_MOD_PIGEON_PMG}</w:t>
+            </w:r>
+          </w:p>
+        </w:tc>
+        <w:tc>
+          <w:p>
+            <w:r>
+              <w:t xml:space="preserve">{T12_VOL_MOD_PINTADE_PMG}</w:t>
+            </w:r>
+          </w:p>
+        </w:tc>
+        <w:tc>
+          <w:p>
+            <w:r>
+              <w:t xml:space="preserve">{T12_VOL_MOD_PAON_PMG}</w:t>
             </w:r>
           </w:p>
         </w:tc>
@@ -1497,70 +1497,70 @@
         <w:tc>
           <w:p>
             <w:r>
-              <w:t xml:space="preserve">{T12_VOL_TRAD_POULET_CHAIR_BDN}</w:t>
-            </w:r>
-          </w:p>
-        </w:tc>
-        <w:tc>
-          <w:p>
-            <w:r>
-              <w:t xml:space="preserve">{T12_VOL_TRAD_PONDEUSE_BDN}</w:t>
-            </w:r>
-          </w:p>
-        </w:tc>
-        <w:tc>
-          <w:p>
-            <w:r>
-              <w:t xml:space="preserve">{T12_VOL_TRAD_POULET_VILLAGEOIS_BDN}</w:t>
-            </w:r>
-          </w:p>
-        </w:tc>
-        <w:tc>
-          <w:p>
-            <w:r>
-              <w:t xml:space="preserve">{T12_VOL_TRAD_CANARD_BDN}</w:t>
-            </w:r>
-          </w:p>
-        </w:tc>
-        <w:tc>
-          <w:p>
-            <w:r>
-              <w:t xml:space="preserve">{T12_VOL_TRAD_OIE_BDN}</w:t>
-            </w:r>
-          </w:p>
-        </w:tc>
-        <w:tc>
-          <w:p>
-            <w:r>
-              <w:t xml:space="preserve">{T12_VOL_TRAD_DINDE_BDN}</w:t>
-            </w:r>
-          </w:p>
-        </w:tc>
-        <w:tc>
-          <w:p>
-            <w:r>
-              <w:t xml:space="preserve">{T12_VOL_TRAD_CAILLE_BDN}</w:t>
-            </w:r>
-          </w:p>
-        </w:tc>
-        <w:tc>
-          <w:p>
-            <w:r>
-              <w:t xml:space="preserve">{T12_VOL_TRAD_PIGEON_BDN}</w:t>
-            </w:r>
-          </w:p>
-        </w:tc>
-        <w:tc>
-          <w:p>
-            <w:r>
-              <w:t xml:space="preserve">{T12_VOL_TRAD_PINTADE_BDN}</w:t>
-            </w:r>
-          </w:p>
-        </w:tc>
-        <w:tc>
-          <w:p>
-            <w:r>
-              <w:t xml:space="preserve">{T12_VOL_TRAD_PAON_BDN}</w:t>
+              <w:t xml:space="preserve">{T12_VOL_TRAD_POULET_CHAIR_PMG}</w:t>
+            </w:r>
+          </w:p>
+        </w:tc>
+        <w:tc>
+          <w:p>
+            <w:r>
+              <w:t xml:space="preserve">{T12_VOL_TRAD_PONDEUSE_PMG}</w:t>
+            </w:r>
+          </w:p>
+        </w:tc>
+        <w:tc>
+          <w:p>
+            <w:r>
+              <w:t xml:space="preserve">{T12_VOL_TRAD_POULET_VILLAGEOIS_PMG}</w:t>
+            </w:r>
+          </w:p>
+        </w:tc>
+        <w:tc>
+          <w:p>
+            <w:r>
+              <w:t xml:space="preserve">{T12_VOL_TRAD_CANARD_PMG}</w:t>
+            </w:r>
+          </w:p>
+        </w:tc>
+        <w:tc>
+          <w:p>
+            <w:r>
+              <w:t xml:space="preserve">{T12_VOL_TRAD_OIE_PMG}</w:t>
+            </w:r>
+          </w:p>
+        </w:tc>
+        <w:tc>
+          <w:p>
+            <w:r>
+              <w:t xml:space="preserve">{T12_VOL_TRAD_DINDE_PMG}</w:t>
+            </w:r>
+          </w:p>
+        </w:tc>
+        <w:tc>
+          <w:p>
+            <w:r>
+              <w:t xml:space="preserve">{T12_VOL_TRAD_CAILLE_PMG}</w:t>
+            </w:r>
+          </w:p>
+        </w:tc>
+        <w:tc>
+          <w:p>
+            <w:r>
+              <w:t xml:space="preserve">{T12_VOL_TRAD_PIGEON_PMG}</w:t>
+            </w:r>
+          </w:p>
+        </w:tc>
+        <w:tc>
+          <w:p>
+            <w:r>
+              <w:t xml:space="preserve">{T12_VOL_TRAD_PINTADE_PMG}</w:t>
+            </w:r>
+          </w:p>
+        </w:tc>
+        <w:tc>
+          <w:p>
+            <w:r>
+              <w:t xml:space="preserve">{T12_VOL_TRAD_PAON_PMG}</w:t>
             </w:r>
           </w:p>
         </w:tc>
@@ -4018,49 +4018,49 @@
         <w:tc>
           <w:p>
             <w:r>
-              <w:t xml:space="preserve">BANDJOUN</w:t>
-            </w:r>
-          </w:p>
-        </w:tc>
-        <w:tc>
-          <w:p>
-            <w:r>
-              <w:t xml:space="preserve">{T21_LIEUX_BDN}</w:t>
-            </w:r>
-          </w:p>
-        </w:tc>
-        <w:tc>
-          <w:p>
-            <w:r>
-              <w:t xml:space="preserve">{T21_ABAT_BOVIN_BDN}</w:t>
-            </w:r>
-          </w:p>
-        </w:tc>
-        <w:tc>
-          <w:p>
-            <w:r>
-              <w:t xml:space="preserve">{T21_ABAT_OVIN_BDN}</w:t>
-            </w:r>
-          </w:p>
-        </w:tc>
-        <w:tc>
-          <w:p>
-            <w:r>
-              <w:t xml:space="preserve">{T21_ABAT_CAPRIN_BDN}</w:t>
-            </w:r>
-          </w:p>
-        </w:tc>
-        <w:tc>
-          <w:p>
-            <w:r>
-              <w:t xml:space="preserve">{T21_ABAT_PORCIN_BDN}</w:t>
-            </w:r>
-          </w:p>
-        </w:tc>
-        <w:tc>
-          <w:p>
-            <w:r>
-              <w:t xml:space="preserve">{T21_ABAT_VOLAILLE_BDN}</w:t>
+              <w:t xml:space="preserve">POUMOUGNE</w:t>
+            </w:r>
+          </w:p>
+        </w:tc>
+        <w:tc>
+          <w:p>
+            <w:r>
+              <w:t xml:space="preserve">{T21_LIEUX_PMG}</w:t>
+            </w:r>
+          </w:p>
+        </w:tc>
+        <w:tc>
+          <w:p>
+            <w:r>
+              <w:t xml:space="preserve">{T21_ABAT_BOVIN_PMG}</w:t>
+            </w:r>
+          </w:p>
+        </w:tc>
+        <w:tc>
+          <w:p>
+            <w:r>
+              <w:t xml:space="preserve">{T21_ABAT_OVIN_PMG}</w:t>
+            </w:r>
+          </w:p>
+        </w:tc>
+        <w:tc>
+          <w:p>
+            <w:r>
+              <w:t xml:space="preserve">{T21_ABAT_CAPRIN_PMG}</w:t>
+            </w:r>
+          </w:p>
+        </w:tc>
+        <w:tc>
+          <w:p>
+            <w:r>
+              <w:t xml:space="preserve">{T21_ABAT_PORCIN_PMG}</w:t>
+            </w:r>
+          </w:p>
+        </w:tc>
+        <w:tc>
+          <w:p>
+            <w:r>
+              <w:t xml:space="preserve">{T21_ABAT_VOLAILLE_PMG}</w:t>
             </w:r>
           </w:p>
         </w:tc>
@@ -4424,7 +4424,7 @@
                 <w:b/>
                 <w:bCs/>
               </w:rPr>
-              <w:t xml:space="preserve">BANDJOUN</w:t>
+              <w:t xml:space="preserve">POUMOUGNE</w:t>
             </w:r>
           </w:p>
         </w:tc>
@@ -4438,35 +4438,35 @@
         <w:tc>
           <w:p>
             <w:r>
-              <w:t xml:space="preserve">{T22_NBABAT_BOVIN_BDN}</w:t>
-            </w:r>
-          </w:p>
-        </w:tc>
-        <w:tc>
-          <w:p>
-            <w:r>
-              <w:t xml:space="preserve">{T22_NBABAT_OVIN_BDN}</w:t>
-            </w:r>
-          </w:p>
-        </w:tc>
-        <w:tc>
-          <w:p>
-            <w:r>
-              <w:t xml:space="preserve">{T22_NBABAT_CAPRIN_BDN}</w:t>
-            </w:r>
-          </w:p>
-        </w:tc>
-        <w:tc>
-          <w:p>
-            <w:r>
-              <w:t xml:space="preserve">{T22_NBABAT_PORC_BDN}</w:t>
-            </w:r>
-          </w:p>
-        </w:tc>
-        <w:tc>
-          <w:p>
-            <w:r>
-              <w:t xml:space="preserve">{T22_NBABAT_VOLAILLE_BDN}</w:t>
+              <w:t xml:space="preserve">{T22_NBABAT_BOVIN_PMG}</w:t>
+            </w:r>
+          </w:p>
+        </w:tc>
+        <w:tc>
+          <w:p>
+            <w:r>
+              <w:t xml:space="preserve">{T22_NBABAT_OVIN_PMG}</w:t>
+            </w:r>
+          </w:p>
+        </w:tc>
+        <w:tc>
+          <w:p>
+            <w:r>
+              <w:t xml:space="preserve">{T22_NBABAT_CAPRIN_PMG}</w:t>
+            </w:r>
+          </w:p>
+        </w:tc>
+        <w:tc>
+          <w:p>
+            <w:r>
+              <w:t xml:space="preserve">{T22_NBABAT_PORC_PMG}</w:t>
+            </w:r>
+          </w:p>
+        </w:tc>
+        <w:tc>
+          <w:p>
+            <w:r>
+              <w:t xml:space="preserve">{T22_NBABAT_VOLAILLE_PMG}</w:t>
             </w:r>
           </w:p>
         </w:tc>
@@ -4499,35 +4499,35 @@
         <w:tc>
           <w:p>
             <w:r>
-              <w:t xml:space="preserve">{T22_VIANDE_BOVIN_BDN}</w:t>
-            </w:r>
-          </w:p>
-        </w:tc>
-        <w:tc>
-          <w:p>
-            <w:r>
-              <w:t xml:space="preserve">{T22_VIANDE_OVIN_BDN}</w:t>
-            </w:r>
-          </w:p>
-        </w:tc>
-        <w:tc>
-          <w:p>
-            <w:r>
-              <w:t xml:space="preserve">{T22_VIANDE_CAPRIN_BDN}</w:t>
-            </w:r>
-          </w:p>
-        </w:tc>
-        <w:tc>
-          <w:p>
-            <w:r>
-              <w:t xml:space="preserve">{T22_VIANDE_PORC_BDN}</w:t>
-            </w:r>
-          </w:p>
-        </w:tc>
-        <w:tc>
-          <w:p>
-            <w:r>
-              <w:t xml:space="preserve">{T22_VIANDE_VOLAILLE_BDN}</w:t>
+              <w:t xml:space="preserve">{T22_VIANDE_BOVIN_PMG}</w:t>
+            </w:r>
+          </w:p>
+        </w:tc>
+        <w:tc>
+          <w:p>
+            <w:r>
+              <w:t xml:space="preserve">{T22_VIANDE_OVIN_PMG}</w:t>
+            </w:r>
+          </w:p>
+        </w:tc>
+        <w:tc>
+          <w:p>
+            <w:r>
+              <w:t xml:space="preserve">{T22_VIANDE_CAPRIN_PMG}</w:t>
+            </w:r>
+          </w:p>
+        </w:tc>
+        <w:tc>
+          <w:p>
+            <w:r>
+              <w:t xml:space="preserve">{T22_VIANDE_PORC_PMG}</w:t>
+            </w:r>
+          </w:p>
+        </w:tc>
+        <w:tc>
+          <w:p>
+            <w:r>
+              <w:t xml:space="preserve">{T22_VIANDE_VOLAILLE_PMG}</w:t>
             </w:r>
           </w:p>
         </w:tc>
@@ -4560,35 +4560,35 @@
         <w:tc>
           <w:p>
             <w:r>
-              <w:t xml:space="preserve">{T22_ABATS_BOVIN_BDN}</w:t>
-            </w:r>
-          </w:p>
-        </w:tc>
-        <w:tc>
-          <w:p>
-            <w:r>
-              <w:t xml:space="preserve">{T22_ABATS_OVIN_BDN}</w:t>
-            </w:r>
-          </w:p>
-        </w:tc>
-        <w:tc>
-          <w:p>
-            <w:r>
-              <w:t xml:space="preserve">{T22_ABATS_CAPRIN_BDN}</w:t>
-            </w:r>
-          </w:p>
-        </w:tc>
-        <w:tc>
-          <w:p>
-            <w:r>
-              <w:t xml:space="preserve">{T22_ABATS_PORC_BDN}</w:t>
-            </w:r>
-          </w:p>
-        </w:tc>
-        <w:tc>
-          <w:p>
-            <w:r>
-              <w:t xml:space="preserve">{T22_ABATS_VOLAILLE_BDN}</w:t>
+              <w:t xml:space="preserve">{T22_ABATS_BOVIN_PMG}</w:t>
+            </w:r>
+          </w:p>
+        </w:tc>
+        <w:tc>
+          <w:p>
+            <w:r>
+              <w:t xml:space="preserve">{T22_ABATS_OVIN_PMG}</w:t>
+            </w:r>
+          </w:p>
+        </w:tc>
+        <w:tc>
+          <w:p>
+            <w:r>
+              <w:t xml:space="preserve">{T22_ABATS_CAPRIN_PMG}</w:t>
+            </w:r>
+          </w:p>
+        </w:tc>
+        <w:tc>
+          <w:p>
+            <w:r>
+              <w:t xml:space="preserve">{T22_ABATS_PORC_PMG}</w:t>
+            </w:r>
+          </w:p>
+        </w:tc>
+        <w:tc>
+          <w:p>
+            <w:r>
+              <w:t xml:space="preserve">{T22_ABATS_VOLAILLE_PMG}</w:t>
             </w:r>
           </w:p>
         </w:tc>
@@ -6053,35 +6053,35 @@
         <w:tc>
           <w:p>
             <w:r>
-              <w:t xml:space="preserve">BANDJOUN</w:t>
-            </w:r>
-          </w:p>
-        </w:tc>
-        <w:tc>
-          <w:p>
-            <w:r>
-              <w:t xml:space="preserve">{T25_LAIT_FRAIS_BDN}</w:t>
-            </w:r>
-          </w:p>
-        </w:tc>
-        <w:tc>
-          <w:p>
-            <w:r>
-              <w:t xml:space="preserve">{T25_PEAUX_BOVIN_BDN}</w:t>
-            </w:r>
-          </w:p>
-        </w:tc>
-        <w:tc>
-          <w:p>
-            <w:r>
-              <w:t xml:space="preserve">{T25_PEAUX_PETITS_RUM_BDN}</w:t>
-            </w:r>
-          </w:p>
-        </w:tc>
-        <w:tc>
-          <w:p>
-            <w:r>
-              <w:t xml:space="preserve">{T25_MIEL_BDN}</w:t>
+              <w:t xml:space="preserve">POUMOUGNE</w:t>
+            </w:r>
+          </w:p>
+        </w:tc>
+        <w:tc>
+          <w:p>
+            <w:r>
+              <w:t xml:space="preserve">{T25_LAIT_FRAIS_PMG}</w:t>
+            </w:r>
+          </w:p>
+        </w:tc>
+        <w:tc>
+          <w:p>
+            <w:r>
+              <w:t xml:space="preserve">{T25_PEAUX_BOVIN_PMG}</w:t>
+            </w:r>
+          </w:p>
+        </w:tc>
+        <w:tc>
+          <w:p>
+            <w:r>
+              <w:t xml:space="preserve">{T25_PEAUX_PETITS_RUM_PMG}</w:t>
+            </w:r>
+          </w:p>
+        </w:tc>
+        <w:tc>
+          <w:p>
+            <w:r>
+              <w:t xml:space="preserve">{T25_MIEL_PMG}</w:t>
             </w:r>
           </w:p>
         </w:tc>
@@ -6513,70 +6513,70 @@
         <w:tc>
           <w:p>
             <w:r>
-              <w:t xml:space="preserve">BANDJOUN</w:t>
-            </w:r>
-          </w:p>
-        </w:tc>
-        <w:tc>
-          <w:p>
-            <w:r>
-              <w:t xml:space="preserve">{T26_VIANDE_BRAISEE_BDN}</w:t>
-            </w:r>
-          </w:p>
-        </w:tc>
-        <w:tc>
-          <w:p>
-            <w:r>
-              <w:t xml:space="preserve">{T26_VIANDE_FUMEE_BDN}</w:t>
-            </w:r>
-          </w:p>
-        </w:tc>
-        <w:tc>
-          <w:p>
-            <w:r>
-              <w:t xml:space="preserve">{T26_LAIT_CAILLE_BDN}</w:t>
-            </w:r>
-          </w:p>
-        </w:tc>
-        <w:tc>
-          <w:p>
-            <w:r>
-              <w:t xml:space="preserve">{T26_YAOURT_BDN}</w:t>
-            </w:r>
-          </w:p>
-        </w:tc>
-        <w:tc>
-          <w:p>
-            <w:r>
-              <w:t xml:space="preserve">{T26_BEURRE_BDN}</w:t>
-            </w:r>
-          </w:p>
-        </w:tc>
-        <w:tc>
-          <w:p>
-            <w:r>
-              <w:t xml:space="preserve">{T26_FROMAGE_BDN}</w:t>
-            </w:r>
-          </w:p>
-        </w:tc>
-        <w:tc>
-          <w:p>
-            <w:r>
-              <w:t xml:space="preserve">{T26_PEAUX_TRANSF_BDN}</w:t>
-            </w:r>
-          </w:p>
-        </w:tc>
-        <w:tc>
-          <w:p>
-            <w:r>
-              <w:t xml:space="preserve">{T26_CUIRS_TRANSF_BDN}</w:t>
-            </w:r>
-          </w:p>
-        </w:tc>
-        <w:tc>
-          <w:p>
-            <w:r>
-              <w:t xml:space="preserve">{T26_POISSON_FUME_BDN}</w:t>
+              <w:t xml:space="preserve">POUMOUGNE</w:t>
+            </w:r>
+          </w:p>
+        </w:tc>
+        <w:tc>
+          <w:p>
+            <w:r>
+              <w:t xml:space="preserve">{T26_VIANDE_BRAISEE_PMG}</w:t>
+            </w:r>
+          </w:p>
+        </w:tc>
+        <w:tc>
+          <w:p>
+            <w:r>
+              <w:t xml:space="preserve">{T26_VIANDE_FUMEE_PMG}</w:t>
+            </w:r>
+          </w:p>
+        </w:tc>
+        <w:tc>
+          <w:p>
+            <w:r>
+              <w:t xml:space="preserve">{T26_LAIT_CAILLE_PMG}</w:t>
+            </w:r>
+          </w:p>
+        </w:tc>
+        <w:tc>
+          <w:p>
+            <w:r>
+              <w:t xml:space="preserve">{T26_YAOURT_PMG}</w:t>
+            </w:r>
+          </w:p>
+        </w:tc>
+        <w:tc>
+          <w:p>
+            <w:r>
+              <w:t xml:space="preserve">{T26_BEURRE_PMG}</w:t>
+            </w:r>
+          </w:p>
+        </w:tc>
+        <w:tc>
+          <w:p>
+            <w:r>
+              <w:t xml:space="preserve">{T26_FROMAGE_PMG}</w:t>
+            </w:r>
+          </w:p>
+        </w:tc>
+        <w:tc>
+          <w:p>
+            <w:r>
+              <w:t xml:space="preserve">{T26_PEAUX_TRANSF_PMG}</w:t>
+            </w:r>
+          </w:p>
+        </w:tc>
+        <w:tc>
+          <w:p>
+            <w:r>
+              <w:t xml:space="preserve">{T26_CUIRS_TRANSF_PMG}</w:t>
+            </w:r>
+          </w:p>
+        </w:tc>
+        <w:tc>
+          <w:p>
+            <w:r>
+              <w:t xml:space="preserve">{T26_POISSON_FUME_PMG}</w:t>
             </w:r>
           </w:p>
         </w:tc>

</xml_diff>